<commit_message>
correcciones en plantillas / test
</commit_message>
<xml_diff>
--- a/plantillas/plantilla_prologoycomedia.docx
+++ b/plantillas/plantilla_prologoycomedia.docx
@@ -2059,19 +2059,7 @@
         <w:rPr>
           <w:lang w:val="es-ES"/>
         </w:rPr>
-        <w:t xml:space="preserve">entrada de </w:t>
-      </w:r>
-      <w:r>
-        <w:rPr>
-          <w:lang w:val="es-ES"/>
-        </w:rPr>
-        <w:t>%</w:t>
-      </w:r>
-      <w:r>
-        <w:rPr>
-          <w:lang w:val="es-ES"/>
-        </w:rPr>
-        <w:t>aparato</w:t>
+        <w:t>entrada de %aparato</w:t>
       </w:r>
       <w:r>
         <w:rPr>
@@ -2596,6 +2584,22 @@
         <w:pStyle w:val="Verso"/>
       </w:pPr>
       <w:r>
+        <w:t>[…]</w:t>
+      </w:r>
+    </w:p>
+    <w:p>
+      <w:pPr>
+        <w:pStyle w:val="Verso"/>
+      </w:pPr>
+      <w:r>
+        <w:t>[…]</w:t>
+      </w:r>
+    </w:p>
+    <w:p>
+      <w:pPr>
+        <w:pStyle w:val="Verso"/>
+      </w:pPr>
+      <w:r>
         <w:t>para completar la estrofa,</w:t>
       </w:r>
     </w:p>
@@ -2638,6 +2642,14 @@
       </w:r>
       <w:r>
         <w:t>:</w:t>
+      </w:r>
+    </w:p>
+    <w:p>
+      <w:pPr>
+        <w:pStyle w:val="Laguna"/>
+      </w:pPr>
+      <w:r>
+        <w:t>[…]</w:t>
       </w:r>
     </w:p>
     <w:p>

</xml_diff>